<commit_message>
updating changes to the Assignments folder
</commit_message>
<xml_diff>
--- a/Assignment1/CSC500 Module 1 - Critical Thinking Assignment.docx
+++ b/Assignment1/CSC500 Module 1 - Critical Thinking Assignment.docx
@@ -19,16 +19,7 @@
           <w:sz w:val="28"/>
           <w:szCs w:val="28"/>
         </w:rPr>
-        <w:t xml:space="preserve">CSC500 </w:t>
-      </w:r>
-      <w:r>
-        <w:rPr>
-          <w:b/>
-          <w:bCs/>
-          <w:sz w:val="28"/>
-          <w:szCs w:val="28"/>
-        </w:rPr>
-        <w:t>Module 1: Critical Thinking Assignment</w:t>
+        <w:t>CSC500 Module 1: Critical Thinking Assignment</w:t>
       </w:r>
     </w:p>
     <w:p>
@@ -60,18 +51,7 @@
           <w:kern w:val="0"/>
           <w14:ligatures w14:val="none"/>
         </w:rPr>
-        <w:t xml:space="preserve">Part 1 - </w:t>
-      </w:r>
-      <w:r>
-        <w:rPr>
-          <w:rFonts w:asciiTheme="majorHAnsi" w:hAnsiTheme="majorHAnsi"/>
-          <w:b/>
-          <w:bCs/>
-          <w:color w:val="156082" w:themeColor="accent1"/>
-          <w:kern w:val="0"/>
-          <w14:ligatures w14:val="none"/>
-        </w:rPr>
-        <w:t xml:space="preserve">Addition and Subtraction </w:t>
+        <w:t xml:space="preserve">Part 1 - Addition and Subtraction </w:t>
       </w:r>
       <w:r>
         <w:rPr>
@@ -244,7 +224,21 @@
         <w:rPr>
           <w:rFonts w:ascii="Calibri" w:hAnsi="Calibri" w:cs="Calibri"/>
         </w:rPr>
-        <w:t xml:space="preserve"> (using strip())</w:t>
+        <w:t xml:space="preserve"> (using </w:t>
+      </w:r>
+      <w:proofErr w:type="gramStart"/>
+      <w:r>
+        <w:rPr>
+          <w:rFonts w:ascii="Calibri" w:hAnsi="Calibri" w:cs="Calibri"/>
+        </w:rPr>
+        <w:t>strip(</w:t>
+      </w:r>
+      <w:proofErr w:type="gramEnd"/>
+      <w:r>
+        <w:rPr>
+          <w:rFonts w:ascii="Calibri" w:hAnsi="Calibri" w:cs="Calibri"/>
+        </w:rPr>
+        <w:t>))</w:t>
       </w:r>
       <w:r>
         <w:rPr>
@@ -406,13 +400,21 @@
         <w:rPr>
           <w:rFonts w:ascii="Calibri" w:hAnsi="Calibri" w:cs="Calibri"/>
         </w:rPr>
-        <w:t xml:space="preserve"> </w:t>
-      </w:r>
-      <w:r>
-        <w:rPr>
-          <w:rFonts w:ascii="Calibri" w:hAnsi="Calibri" w:cs="Calibri"/>
-        </w:rPr>
-        <w:t>(using strip())</w:t>
+        <w:t xml:space="preserve"> (using </w:t>
+      </w:r>
+      <w:proofErr w:type="gramStart"/>
+      <w:r>
+        <w:rPr>
+          <w:rFonts w:ascii="Calibri" w:hAnsi="Calibri" w:cs="Calibri"/>
+        </w:rPr>
+        <w:t>strip(</w:t>
+      </w:r>
+      <w:proofErr w:type="gramEnd"/>
+      <w:r>
+        <w:rPr>
+          <w:rFonts w:ascii="Calibri" w:hAnsi="Calibri" w:cs="Calibri"/>
+        </w:rPr>
+        <w:t>))</w:t>
       </w:r>
       <w:r>
         <w:rPr>
@@ -488,6 +490,12 @@
           <w:rFonts w:ascii="Calibri" w:hAnsi="Calibri" w:cs="Calibri"/>
         </w:rPr>
         <w:br/>
+      </w:r>
+      <w:r>
+        <w:rPr>
+          <w:rFonts w:ascii="Calibri" w:hAnsi="Calibri" w:cs="Calibri"/>
+        </w:rPr>
+        <w:lastRenderedPageBreak/>
         <w:t xml:space="preserve">        EXIT loop</w:t>
       </w:r>
       <w:r>
@@ -863,6 +871,7 @@
             <w14:bevel/>
           </w14:textOutline>
         </w:rPr>
+        <w:lastRenderedPageBreak/>
         <w:t>Source Code</w:t>
       </w:r>
     </w:p>
@@ -1045,7 +1054,21 @@
           <w:rFonts w:ascii="Calibri" w:hAnsi="Calibri" w:cs="Calibri"/>
         </w:rPr>
         <w:br/>
-        <w:t xml:space="preserve">        print("Invalid Input!! Please enter only numerical values either positive or negative.\n")</w:t>
+        <w:t xml:space="preserve">        </w:t>
+      </w:r>
+      <w:proofErr w:type="gramStart"/>
+      <w:r>
+        <w:rPr>
+          <w:rFonts w:ascii="Calibri" w:hAnsi="Calibri" w:cs="Calibri"/>
+        </w:rPr>
+        <w:t>print(</w:t>
+      </w:r>
+      <w:proofErr w:type="gramEnd"/>
+      <w:r>
+        <w:rPr>
+          <w:rFonts w:ascii="Calibri" w:hAnsi="Calibri" w:cs="Calibri"/>
+        </w:rPr>
+        <w:t>"Invalid Input!! Please enter only numerical values either positive or negative.\n")</w:t>
       </w:r>
       <w:r>
         <w:rPr>
@@ -1112,6 +1135,12 @@
           <w:rFonts w:ascii="Calibri" w:hAnsi="Calibri" w:cs="Calibri"/>
         </w:rPr>
         <w:br/>
+      </w:r>
+      <w:r>
+        <w:rPr>
+          <w:rFonts w:ascii="Calibri" w:hAnsi="Calibri" w:cs="Calibri"/>
+        </w:rPr>
+        <w:lastRenderedPageBreak/>
         <w:t xml:space="preserve">            print("Input value cannot be empty!! Please enter a valid number either positive or negative.\n")</w:t>
       </w:r>
       <w:r>
@@ -1165,7 +1194,21 @@
           <w:rFonts w:ascii="Calibri" w:hAnsi="Calibri" w:cs="Calibri"/>
         </w:rPr>
         <w:br/>
-        <w:t xml:space="preserve">        print("Invalid Input!! Please enter only numerical values either positive or negative.\n")</w:t>
+        <w:t xml:space="preserve">        </w:t>
+      </w:r>
+      <w:proofErr w:type="gramStart"/>
+      <w:r>
+        <w:rPr>
+          <w:rFonts w:ascii="Calibri" w:hAnsi="Calibri" w:cs="Calibri"/>
+        </w:rPr>
+        <w:t>print(</w:t>
+      </w:r>
+      <w:proofErr w:type="gramEnd"/>
+      <w:r>
+        <w:rPr>
+          <w:rFonts w:ascii="Calibri" w:hAnsi="Calibri" w:cs="Calibri"/>
+        </w:rPr>
+        <w:t>"Invalid Input!! Please enter only numerical values either positive or negative.\n")</w:t>
       </w:r>
       <w:r>
         <w:rPr>
@@ -1205,21 +1248,60 @@
           <w:rFonts w:ascii="Calibri" w:hAnsi="Calibri" w:cs="Calibri"/>
         </w:rPr>
         <w:br/>
-        <w:t>print("\n***** Result Summary *****\n")</w:t>
-      </w:r>
-      <w:r>
-        <w:rPr>
-          <w:rFonts w:ascii="Calibri" w:hAnsi="Calibri" w:cs="Calibri"/>
-        </w:rPr>
-        <w:br/>
-        <w:t>print("Result for Addition of Numbers:", addition)</w:t>
-      </w:r>
-      <w:r>
-        <w:rPr>
-          <w:rFonts w:ascii="Calibri" w:hAnsi="Calibri" w:cs="Calibri"/>
-        </w:rPr>
-        <w:br/>
-        <w:t>print("Result for subtraction of Numbers:", subtraction)</w:t>
+      </w:r>
+      <w:proofErr w:type="gramStart"/>
+      <w:r>
+        <w:rPr>
+          <w:rFonts w:ascii="Calibri" w:hAnsi="Calibri" w:cs="Calibri"/>
+        </w:rPr>
+        <w:t>print(</w:t>
+      </w:r>
+      <w:proofErr w:type="gramEnd"/>
+      <w:r>
+        <w:rPr>
+          <w:rFonts w:ascii="Calibri" w:hAnsi="Calibri" w:cs="Calibri"/>
+        </w:rPr>
+        <w:t>"\n***** Result Summary *****\n")</w:t>
+      </w:r>
+      <w:r>
+        <w:rPr>
+          <w:rFonts w:ascii="Calibri" w:hAnsi="Calibri" w:cs="Calibri"/>
+        </w:rPr>
+        <w:br/>
+      </w:r>
+      <w:proofErr w:type="gramStart"/>
+      <w:r>
+        <w:rPr>
+          <w:rFonts w:ascii="Calibri" w:hAnsi="Calibri" w:cs="Calibri"/>
+        </w:rPr>
+        <w:t>print(</w:t>
+      </w:r>
+      <w:proofErr w:type="gramEnd"/>
+      <w:r>
+        <w:rPr>
+          <w:rFonts w:ascii="Calibri" w:hAnsi="Calibri" w:cs="Calibri"/>
+        </w:rPr>
+        <w:t>"Result for Addition of Numbers:", addition)</w:t>
+      </w:r>
+      <w:r>
+        <w:rPr>
+          <w:rFonts w:ascii="Calibri" w:hAnsi="Calibri" w:cs="Calibri"/>
+        </w:rPr>
+        <w:br/>
+      </w:r>
+      <w:proofErr w:type="gramStart"/>
+      <w:r>
+        <w:rPr>
+          <w:rFonts w:ascii="Calibri" w:hAnsi="Calibri" w:cs="Calibri"/>
+        </w:rPr>
+        <w:t>print(</w:t>
+      </w:r>
+      <w:proofErr w:type="gramEnd"/>
+      <w:r>
+        <w:rPr>
+          <w:rFonts w:ascii="Calibri" w:hAnsi="Calibri" w:cs="Calibri"/>
+        </w:rPr>
+        <w:t>"Result for subtraction of Numbers:", subtraction)</w:t>
       </w:r>
     </w:p>
     <w:p>
@@ -1262,6 +1344,7 @@
       <w:r>
         <w:rPr>
           <w:rFonts w:cs="Calibri"/>
+          <w:noProof/>
           <w:sz w:val="26"/>
           <w:szCs w:val="26"/>
           <w14:textOutline w14:w="9525" w14:cap="rnd" w14:cmpd="sng" w14:algn="ctr">
@@ -1352,6 +1435,7 @@
       <w:r>
         <w:rPr>
           <w:rFonts w:cs="Calibri"/>
+          <w:noProof/>
           <w:sz w:val="26"/>
           <w:szCs w:val="26"/>
           <w14:textOutline w14:w="9525" w14:cap="rnd" w14:cmpd="sng" w14:algn="ctr">
@@ -1365,6 +1449,7 @@
             <w14:bevel/>
           </w14:textOutline>
         </w:rPr>
+        <w:lastRenderedPageBreak/>
         <w:drawing>
           <wp:inline distT="0" distB="0" distL="0" distR="0" wp14:anchorId="1E679BD5" wp14:editId="0BAE0B97">
             <wp:extent cx="5943600" cy="3532505"/>
@@ -1702,6 +1787,7 @@
             <w14:bevel/>
           </w14:textOutline>
         </w:rPr>
+        <w:lastRenderedPageBreak/>
         <w:t>Program Execution Screenshots</w:t>
       </w:r>
     </w:p>
@@ -1735,6 +1821,7 @@
       <w:r>
         <w:rPr>
           <w:rFonts w:ascii="Calibri" w:hAnsi="Calibri" w:cs="Calibri"/>
+          <w:noProof/>
         </w:rPr>
         <w:drawing>
           <wp:inline distT="0" distB="0" distL="0" distR="0" wp14:anchorId="0F88DF6E" wp14:editId="2214D829">
@@ -1789,6 +1876,7 @@
       <w:r>
         <w:rPr>
           <w:rFonts w:ascii="Calibri" w:hAnsi="Calibri" w:cs="Calibri"/>
+          <w:noProof/>
         </w:rPr>
         <w:drawing>
           <wp:inline distT="0" distB="0" distL="0" distR="0" wp14:anchorId="26503F9D" wp14:editId="2B1B69A1">
@@ -1888,6 +1976,7 @@
           <w:b/>
           <w:bCs/>
         </w:rPr>
+        <w:lastRenderedPageBreak/>
         <w:t xml:space="preserve">Validation </w:t>
       </w:r>
       <w:r>
@@ -1910,24 +1999,19 @@
         <w:rPr>
           <w:rFonts w:ascii="Calibri" w:hAnsi="Calibri" w:cs="Calibri"/>
         </w:rPr>
-        <w:t xml:space="preserve"> When input for first number</w:t>
-      </w:r>
-      <w:r>
-        <w:rPr>
-          <w:rFonts w:ascii="Calibri" w:hAnsi="Calibri" w:cs="Calibri"/>
-        </w:rPr>
-        <w:t xml:space="preserve"> is strings</w:t>
-      </w:r>
-    </w:p>
-    <w:p>
-      <w:pPr>
-        <w:rPr>
-          <w:rFonts w:ascii="Calibri" w:hAnsi="Calibri" w:cs="Calibri"/>
-        </w:rPr>
-      </w:pPr>
-      <w:r>
-        <w:rPr>
-          <w:rFonts w:ascii="Calibri" w:hAnsi="Calibri" w:cs="Calibri"/>
+        <w:t xml:space="preserve"> When input for first number is strings</w:t>
+      </w:r>
+    </w:p>
+    <w:p>
+      <w:pPr>
+        <w:rPr>
+          <w:rFonts w:ascii="Calibri" w:hAnsi="Calibri" w:cs="Calibri"/>
+        </w:rPr>
+      </w:pPr>
+      <w:r>
+        <w:rPr>
+          <w:rFonts w:ascii="Calibri" w:hAnsi="Calibri" w:cs="Calibri"/>
+          <w:noProof/>
         </w:rPr>
         <w:drawing>
           <wp:inline distT="0" distB="0" distL="0" distR="0" wp14:anchorId="7846BB1B" wp14:editId="7F07D93A">
@@ -1982,6 +2066,7 @@
       <w:r>
         <w:rPr>
           <w:rFonts w:ascii="Calibri" w:hAnsi="Calibri" w:cs="Calibri"/>
+          <w:noProof/>
         </w:rPr>
         <w:drawing>
           <wp:inline distT="0" distB="0" distL="0" distR="0" wp14:anchorId="662C575B" wp14:editId="18818C84">
@@ -2068,24 +2153,33 @@
         <w:rPr>
           <w:rFonts w:ascii="Calibri" w:hAnsi="Calibri" w:cs="Calibri"/>
         </w:rPr>
-        <w:t xml:space="preserve"> When </w:t>
-      </w:r>
-      <w:r>
-        <w:rPr>
-          <w:rFonts w:ascii="Calibri" w:hAnsi="Calibri" w:cs="Calibri"/>
-        </w:rPr>
-        <w:t xml:space="preserve">first number is provided with valid value and second number is empty, validation message should be shown and should ask to re-enter second number </w:t>
-      </w:r>
-    </w:p>
-    <w:p>
-      <w:pPr>
-        <w:rPr>
-          <w:rFonts w:ascii="Calibri" w:hAnsi="Calibri" w:cs="Calibri"/>
-        </w:rPr>
-      </w:pPr>
-      <w:r>
-        <w:rPr>
-          <w:rFonts w:ascii="Calibri" w:hAnsi="Calibri" w:cs="Calibri"/>
+        <w:t xml:space="preserve"> When first number is provided with valid value and second number is empty, validation message should be shown </w:t>
+      </w:r>
+      <w:proofErr w:type="gramStart"/>
+      <w:r>
+        <w:rPr>
+          <w:rFonts w:ascii="Calibri" w:hAnsi="Calibri" w:cs="Calibri"/>
+        </w:rPr>
+        <w:t>and</w:t>
+      </w:r>
+      <w:proofErr w:type="gramEnd"/>
+      <w:r>
+        <w:rPr>
+          <w:rFonts w:ascii="Calibri" w:hAnsi="Calibri" w:cs="Calibri"/>
+        </w:rPr>
+        <w:t xml:space="preserve"> should ask to re-enter second number </w:t>
+      </w:r>
+    </w:p>
+    <w:p>
+      <w:pPr>
+        <w:rPr>
+          <w:rFonts w:ascii="Calibri" w:hAnsi="Calibri" w:cs="Calibri"/>
+        </w:rPr>
+      </w:pPr>
+      <w:r>
+        <w:rPr>
+          <w:rFonts w:ascii="Calibri" w:hAnsi="Calibri" w:cs="Calibri"/>
+          <w:noProof/>
         </w:rPr>
         <w:drawing>
           <wp:inline distT="0" distB="0" distL="0" distR="0" wp14:anchorId="701EFA96" wp14:editId="3600746F">
@@ -2185,6 +2279,7 @@
           <w:b/>
           <w:bCs/>
         </w:rPr>
+        <w:lastRenderedPageBreak/>
         <w:t xml:space="preserve">Validation </w:t>
       </w:r>
       <w:r>
@@ -2207,30 +2302,19 @@
         <w:rPr>
           <w:rFonts w:ascii="Calibri" w:hAnsi="Calibri" w:cs="Calibri"/>
         </w:rPr>
-        <w:t xml:space="preserve"> When first number is provided with valid value and second number is</w:t>
-      </w:r>
-      <w:r>
-        <w:rPr>
-          <w:rFonts w:ascii="Calibri" w:hAnsi="Calibri" w:cs="Calibri"/>
-        </w:rPr>
-        <w:t xml:space="preserve"> inputted string value</w:t>
-      </w:r>
-      <w:r>
-        <w:rPr>
-          <w:rFonts w:ascii="Calibri" w:hAnsi="Calibri" w:cs="Calibri"/>
-        </w:rPr>
-        <w:t xml:space="preserve">, validation message should be shown and should ask to re-enter second number </w:t>
-      </w:r>
-    </w:p>
-    <w:p>
-      <w:pPr>
-        <w:rPr>
-          <w:rFonts w:ascii="Calibri" w:hAnsi="Calibri" w:cs="Calibri"/>
-        </w:rPr>
-      </w:pPr>
-      <w:r>
-        <w:rPr>
-          <w:rFonts w:ascii="Calibri" w:hAnsi="Calibri" w:cs="Calibri"/>
+        <w:t xml:space="preserve"> When first number is provided with valid value and second number is inputted string value, validation message should be shown and should ask to re-enter second number </w:t>
+      </w:r>
+    </w:p>
+    <w:p>
+      <w:pPr>
+        <w:rPr>
+          <w:rFonts w:ascii="Calibri" w:hAnsi="Calibri" w:cs="Calibri"/>
+        </w:rPr>
+      </w:pPr>
+      <w:r>
+        <w:rPr>
+          <w:rFonts w:ascii="Calibri" w:hAnsi="Calibri" w:cs="Calibri"/>
+          <w:noProof/>
         </w:rPr>
         <w:drawing>
           <wp:inline distT="0" distB="0" distL="0" distR="0" wp14:anchorId="6717590D" wp14:editId="2D259D0E">
@@ -2382,6 +2466,7 @@
       <w:r>
         <w:rPr>
           <w:rFonts w:ascii="Calibri" w:hAnsi="Calibri" w:cs="Calibri"/>
+          <w:noProof/>
         </w:rPr>
         <w:drawing>
           <wp:inline distT="0" distB="0" distL="0" distR="0" wp14:anchorId="7CBFAF18" wp14:editId="56D4A6A9">
@@ -2483,7 +2568,8 @@
           <w:kern w:val="0"/>
           <w14:ligatures w14:val="none"/>
         </w:rPr>
-        <w:t xml:space="preserve">Part </w:t>
+        <w:lastRenderedPageBreak/>
+        <w:t>Part 2 - Multiplication and Division of Numbers with Input Validation</w:t>
       </w:r>
       <w:r>
         <w:rPr>
@@ -2494,72 +2580,6 @@
           <w:kern w:val="0"/>
           <w14:ligatures w14:val="none"/>
         </w:rPr>
-        <w:t>2</w:t>
-      </w:r>
-      <w:r>
-        <w:rPr>
-          <w:rFonts w:asciiTheme="majorHAnsi" w:hAnsiTheme="majorHAnsi"/>
-          <w:b/>
-          <w:bCs/>
-          <w:color w:val="156082" w:themeColor="accent1"/>
-          <w:kern w:val="0"/>
-          <w14:ligatures w14:val="none"/>
-        </w:rPr>
-        <w:t xml:space="preserve"> - </w:t>
-      </w:r>
-      <w:r>
-        <w:rPr>
-          <w:rFonts w:asciiTheme="majorHAnsi" w:hAnsiTheme="majorHAnsi"/>
-          <w:b/>
-          <w:bCs/>
-          <w:color w:val="156082" w:themeColor="accent1"/>
-          <w:kern w:val="0"/>
-          <w14:ligatures w14:val="none"/>
-        </w:rPr>
-        <w:t>Multiplication</w:t>
-      </w:r>
-      <w:r>
-        <w:rPr>
-          <w:rFonts w:asciiTheme="majorHAnsi" w:hAnsiTheme="majorHAnsi"/>
-          <w:b/>
-          <w:bCs/>
-          <w:color w:val="156082" w:themeColor="accent1"/>
-          <w:kern w:val="0"/>
-          <w14:ligatures w14:val="none"/>
-        </w:rPr>
-        <w:t xml:space="preserve"> and </w:t>
-      </w:r>
-      <w:r>
-        <w:rPr>
-          <w:rFonts w:asciiTheme="majorHAnsi" w:hAnsiTheme="majorHAnsi"/>
-          <w:b/>
-          <w:bCs/>
-          <w:color w:val="156082" w:themeColor="accent1"/>
-          <w:kern w:val="0"/>
-          <w14:ligatures w14:val="none"/>
-        </w:rPr>
-        <w:t>Division of Numbers</w:t>
-      </w:r>
-      <w:r>
-        <w:rPr>
-          <w:rFonts w:asciiTheme="majorHAnsi" w:hAnsiTheme="majorHAnsi"/>
-          <w:b/>
-          <w:bCs/>
-          <w:color w:val="156082" w:themeColor="accent1"/>
-          <w:kern w:val="0"/>
-          <w14:ligatures w14:val="none"/>
-        </w:rPr>
-        <w:t xml:space="preserve"> with Input Validation</w:t>
-      </w:r>
-      <w:r>
-        <w:rPr>
-          <w:rFonts w:asciiTheme="majorHAnsi" w:hAnsiTheme="majorHAnsi"/>
-          <w:b/>
-          <w:bCs/>
-          <w:color w:val="156082" w:themeColor="accent1"/>
-          <w:kern w:val="0"/>
-          <w14:ligatures w14:val="none"/>
-        </w:rPr>
         <w:t xml:space="preserve"> </w:t>
       </w:r>
     </w:p>
@@ -2657,13 +2677,21 @@
         <w:rPr>
           <w:rFonts w:ascii="Calibri" w:hAnsi="Calibri" w:cs="Calibri"/>
         </w:rPr>
-        <w:t xml:space="preserve"> </w:t>
-      </w:r>
-      <w:r>
-        <w:rPr>
-          <w:rFonts w:ascii="Calibri" w:hAnsi="Calibri" w:cs="Calibri"/>
-        </w:rPr>
-        <w:t>(using strip())</w:t>
+        <w:t xml:space="preserve"> (using </w:t>
+      </w:r>
+      <w:proofErr w:type="gramStart"/>
+      <w:r>
+        <w:rPr>
+          <w:rFonts w:ascii="Calibri" w:hAnsi="Calibri" w:cs="Calibri"/>
+        </w:rPr>
+        <w:t>strip(</w:t>
+      </w:r>
+      <w:proofErr w:type="gramEnd"/>
+      <w:r>
+        <w:rPr>
+          <w:rFonts w:ascii="Calibri" w:hAnsi="Calibri" w:cs="Calibri"/>
+        </w:rPr>
+        <w:t>))</w:t>
       </w:r>
       <w:r>
         <w:rPr>
@@ -2837,13 +2865,21 @@
         <w:rPr>
           <w:rFonts w:ascii="Calibri" w:hAnsi="Calibri" w:cs="Calibri"/>
         </w:rPr>
-        <w:t xml:space="preserve"> </w:t>
-      </w:r>
-      <w:r>
-        <w:rPr>
-          <w:rFonts w:ascii="Calibri" w:hAnsi="Calibri" w:cs="Calibri"/>
-        </w:rPr>
-        <w:t>(using strip())</w:t>
+        <w:t xml:space="preserve"> (using </w:t>
+      </w:r>
+      <w:proofErr w:type="gramStart"/>
+      <w:r>
+        <w:rPr>
+          <w:rFonts w:ascii="Calibri" w:hAnsi="Calibri" w:cs="Calibri"/>
+        </w:rPr>
+        <w:t>strip(</w:t>
+      </w:r>
+      <w:proofErr w:type="gramEnd"/>
+      <w:r>
+        <w:rPr>
+          <w:rFonts w:ascii="Calibri" w:hAnsi="Calibri" w:cs="Calibri"/>
+        </w:rPr>
+        <w:t>))</w:t>
       </w:r>
       <w:r>
         <w:rPr>
@@ -2932,7 +2968,35 @@
         <w:rPr>
           <w:rFonts w:ascii="Calibri" w:hAnsi="Calibri" w:cs="Calibri"/>
         </w:rPr>
-        <w:t>Division by Zero provides a Undefined value. Enter a Non-Zero value</w:t>
+        <w:t xml:space="preserve">Division by Zero provides </w:t>
+      </w:r>
+      <w:proofErr w:type="gramStart"/>
+      <w:r>
+        <w:rPr>
+          <w:rFonts w:ascii="Calibri" w:hAnsi="Calibri" w:cs="Calibri"/>
+        </w:rPr>
+        <w:t>a</w:t>
+      </w:r>
+      <w:proofErr w:type="gramEnd"/>
+      <w:r>
+        <w:rPr>
+          <w:rFonts w:ascii="Calibri" w:hAnsi="Calibri" w:cs="Calibri"/>
+        </w:rPr>
+        <w:t xml:space="preserve"> Undefined value. Enter a </w:t>
+      </w:r>
+      <w:proofErr w:type="gramStart"/>
+      <w:r>
+        <w:rPr>
+          <w:rFonts w:ascii="Calibri" w:hAnsi="Calibri" w:cs="Calibri"/>
+        </w:rPr>
+        <w:t>Non-Zero</w:t>
+      </w:r>
+      <w:proofErr w:type="gramEnd"/>
+      <w:r>
+        <w:rPr>
+          <w:rFonts w:ascii="Calibri" w:hAnsi="Calibri" w:cs="Calibri"/>
+        </w:rPr>
+        <w:t xml:space="preserve"> value</w:t>
       </w:r>
       <w:r>
         <w:rPr>
@@ -2952,6 +3016,12 @@
           <w:rFonts w:ascii="Calibri" w:hAnsi="Calibri" w:cs="Calibri"/>
         </w:rPr>
         <w:br/>
+      </w:r>
+      <w:r>
+        <w:rPr>
+          <w:rFonts w:ascii="Calibri" w:hAnsi="Calibri" w:cs="Calibri"/>
+        </w:rPr>
+        <w:lastRenderedPageBreak/>
         <w:t xml:space="preserve">        ENDIF</w:t>
       </w:r>
       <w:r>
@@ -3080,6 +3150,27 @@
         </w:rPr>
         <w:br/>
       </w:r>
+    </w:p>
+    <w:p>
+      <w:pPr>
+        <w:rPr>
+          <w:rFonts w:ascii="Calibri" w:hAnsi="Calibri" w:cs="Calibri"/>
+        </w:rPr>
+      </w:pPr>
+    </w:p>
+    <w:p>
+      <w:pPr>
+        <w:rPr>
+          <w:rFonts w:ascii="Calibri" w:hAnsi="Calibri" w:cs="Calibri"/>
+        </w:rPr>
+      </w:pPr>
+    </w:p>
+    <w:p>
+      <w:pPr>
+        <w:rPr>
+          <w:rFonts w:ascii="Calibri" w:hAnsi="Calibri" w:cs="Calibri"/>
+        </w:rPr>
+      </w:pPr>
     </w:p>
     <w:p>
       <w:pPr>
@@ -3192,6 +3283,7 @@
             <w14:bevel/>
           </w14:textOutline>
         </w:rPr>
+        <w:lastRenderedPageBreak/>
         <w:t>Source Code</w:t>
       </w:r>
     </w:p>
@@ -3393,7 +3485,21 @@
           <w:rFonts w:ascii="Calibri" w:hAnsi="Calibri" w:cs="Calibri"/>
         </w:rPr>
         <w:br/>
-        <w:t xml:space="preserve">        print("Invalid Input!! Please enter only numerical values either positive or negative.\n")</w:t>
+        <w:t xml:space="preserve">        </w:t>
+      </w:r>
+      <w:proofErr w:type="gramStart"/>
+      <w:r>
+        <w:rPr>
+          <w:rFonts w:ascii="Calibri" w:hAnsi="Calibri" w:cs="Calibri"/>
+        </w:rPr>
+        <w:t>print(</w:t>
+      </w:r>
+      <w:proofErr w:type="gramEnd"/>
+      <w:r>
+        <w:rPr>
+          <w:rFonts w:ascii="Calibri" w:hAnsi="Calibri" w:cs="Calibri"/>
+        </w:rPr>
+        <w:t>"Invalid Input!! Please enter only numerical values either positive or negative.\n")</w:t>
       </w:r>
       <w:r>
         <w:rPr>
@@ -3460,6 +3566,12 @@
           <w:rFonts w:ascii="Calibri" w:hAnsi="Calibri" w:cs="Calibri"/>
         </w:rPr>
         <w:br/>
+      </w:r>
+      <w:r>
+        <w:rPr>
+          <w:rFonts w:ascii="Calibri" w:hAnsi="Calibri" w:cs="Calibri"/>
+        </w:rPr>
+        <w:lastRenderedPageBreak/>
         <w:t xml:space="preserve">            print("Input value cannot be empty!! Please enter a valid number either positive or negative.\n")</w:t>
       </w:r>
       <w:r>
@@ -3507,7 +3619,49 @@
           <w:rFonts w:ascii="Calibri" w:hAnsi="Calibri" w:cs="Calibri"/>
         </w:rPr>
         <w:br/>
-        <w:t xml:space="preserve">            print("Division by Zero provides a Undefined value. Enter a Non-Zero value\n")</w:t>
+        <w:t xml:space="preserve">            </w:t>
+      </w:r>
+      <w:proofErr w:type="gramStart"/>
+      <w:r>
+        <w:rPr>
+          <w:rFonts w:ascii="Calibri" w:hAnsi="Calibri" w:cs="Calibri"/>
+        </w:rPr>
+        <w:t>print(</w:t>
+      </w:r>
+      <w:proofErr w:type="gramEnd"/>
+      <w:r>
+        <w:rPr>
+          <w:rFonts w:ascii="Calibri" w:hAnsi="Calibri" w:cs="Calibri"/>
+        </w:rPr>
+        <w:t xml:space="preserve">"Division by Zero provides </w:t>
+      </w:r>
+      <w:proofErr w:type="gramStart"/>
+      <w:r>
+        <w:rPr>
+          <w:rFonts w:ascii="Calibri" w:hAnsi="Calibri" w:cs="Calibri"/>
+        </w:rPr>
+        <w:t>a</w:t>
+      </w:r>
+      <w:proofErr w:type="gramEnd"/>
+      <w:r>
+        <w:rPr>
+          <w:rFonts w:ascii="Calibri" w:hAnsi="Calibri" w:cs="Calibri"/>
+        </w:rPr>
+        <w:t xml:space="preserve"> Undefined value. Enter a </w:t>
+      </w:r>
+      <w:proofErr w:type="gramStart"/>
+      <w:r>
+        <w:rPr>
+          <w:rFonts w:ascii="Calibri" w:hAnsi="Calibri" w:cs="Calibri"/>
+        </w:rPr>
+        <w:t>Non-Zero</w:t>
+      </w:r>
+      <w:proofErr w:type="gramEnd"/>
+      <w:r>
+        <w:rPr>
+          <w:rFonts w:ascii="Calibri" w:hAnsi="Calibri" w:cs="Calibri"/>
+        </w:rPr>
+        <w:t xml:space="preserve"> value\n")</w:t>
       </w:r>
       <w:r>
         <w:rPr>
@@ -3541,7 +3695,21 @@
           <w:rFonts w:ascii="Calibri" w:hAnsi="Calibri" w:cs="Calibri"/>
         </w:rPr>
         <w:br/>
-        <w:t xml:space="preserve">        print("Invalid Input!! Please enter only numerical values either positive or negative.\n")</w:t>
+        <w:t xml:space="preserve">        </w:t>
+      </w:r>
+      <w:proofErr w:type="gramStart"/>
+      <w:r>
+        <w:rPr>
+          <w:rFonts w:ascii="Calibri" w:hAnsi="Calibri" w:cs="Calibri"/>
+        </w:rPr>
+        <w:t>print(</w:t>
+      </w:r>
+      <w:proofErr w:type="gramEnd"/>
+      <w:r>
+        <w:rPr>
+          <w:rFonts w:ascii="Calibri" w:hAnsi="Calibri" w:cs="Calibri"/>
+        </w:rPr>
+        <w:t>"Invalid Input!! Please enter only numerical values either positive or negative.\n")</w:t>
       </w:r>
       <w:r>
         <w:rPr>
@@ -3581,33 +3749,74 @@
           <w:rFonts w:ascii="Calibri" w:hAnsi="Calibri" w:cs="Calibri"/>
         </w:rPr>
         <w:br/>
-        <w:t>print("\n***** Result Summary *****\n")</w:t>
-      </w:r>
-      <w:r>
-        <w:rPr>
-          <w:rFonts w:ascii="Calibri" w:hAnsi="Calibri" w:cs="Calibri"/>
-        </w:rPr>
-        <w:br/>
-        <w:t>print("Result for Multiplication of Numbers:", addition)</w:t>
-      </w:r>
-      <w:r>
-        <w:rPr>
-          <w:rFonts w:ascii="Calibri" w:hAnsi="Calibri" w:cs="Calibri"/>
-        </w:rPr>
-        <w:br/>
-        <w:t>print("Result for Division of Numbers:", subtraction)</w:t>
-      </w:r>
-    </w:p>
-    <w:p>
-      <w:pPr>
-        <w:rPr>
-          <w:rFonts w:ascii="Calibri" w:hAnsi="Calibri" w:cs="Calibri"/>
-        </w:rPr>
-      </w:pPr>
-      <w:r>
-        <w:rPr>
-          <w:rFonts w:ascii="Calibri" w:hAnsi="Calibri" w:cs="Calibri"/>
-        </w:rPr>
+      </w:r>
+      <w:proofErr w:type="gramStart"/>
+      <w:r>
+        <w:rPr>
+          <w:rFonts w:ascii="Calibri" w:hAnsi="Calibri" w:cs="Calibri"/>
+        </w:rPr>
+        <w:t>print(</w:t>
+      </w:r>
+      <w:proofErr w:type="gramEnd"/>
+      <w:r>
+        <w:rPr>
+          <w:rFonts w:ascii="Calibri" w:hAnsi="Calibri" w:cs="Calibri"/>
+        </w:rPr>
+        <w:t>"\n***** Result Summary *****\n")</w:t>
+      </w:r>
+      <w:r>
+        <w:rPr>
+          <w:rFonts w:ascii="Calibri" w:hAnsi="Calibri" w:cs="Calibri"/>
+        </w:rPr>
+        <w:br/>
+      </w:r>
+      <w:proofErr w:type="gramStart"/>
+      <w:r>
+        <w:rPr>
+          <w:rFonts w:ascii="Calibri" w:hAnsi="Calibri" w:cs="Calibri"/>
+        </w:rPr>
+        <w:t>print(</w:t>
+      </w:r>
+      <w:proofErr w:type="gramEnd"/>
+      <w:r>
+        <w:rPr>
+          <w:rFonts w:ascii="Calibri" w:hAnsi="Calibri" w:cs="Calibri"/>
+        </w:rPr>
+        <w:t>"Result for Multiplication of Numbers:", addition)</w:t>
+      </w:r>
+      <w:r>
+        <w:rPr>
+          <w:rFonts w:ascii="Calibri" w:hAnsi="Calibri" w:cs="Calibri"/>
+        </w:rPr>
+        <w:br/>
+      </w:r>
+      <w:proofErr w:type="gramStart"/>
+      <w:r>
+        <w:rPr>
+          <w:rFonts w:ascii="Calibri" w:hAnsi="Calibri" w:cs="Calibri"/>
+        </w:rPr>
+        <w:t>print(</w:t>
+      </w:r>
+      <w:proofErr w:type="gramEnd"/>
+      <w:r>
+        <w:rPr>
+          <w:rFonts w:ascii="Calibri" w:hAnsi="Calibri" w:cs="Calibri"/>
+        </w:rPr>
+        <w:t>"Result for Division of Numbers:", subtraction)</w:t>
+      </w:r>
+    </w:p>
+    <w:p>
+      <w:pPr>
+        <w:rPr>
+          <w:rFonts w:ascii="Calibri" w:hAnsi="Calibri" w:cs="Calibri"/>
+        </w:rPr>
+      </w:pPr>
+      <w:r>
+        <w:rPr>
+          <w:rFonts w:ascii="Calibri" w:hAnsi="Calibri" w:cs="Calibri"/>
+          <w:noProof/>
+        </w:rPr>
+        <w:lastRenderedPageBreak/>
         <w:drawing>
           <wp:inline distT="0" distB="0" distL="0" distR="0" wp14:anchorId="1D089014" wp14:editId="747C383D">
             <wp:extent cx="5943600" cy="3527425"/>
@@ -3668,6 +3877,7 @@
       <w:r>
         <w:rPr>
           <w:rFonts w:ascii="Calibri" w:hAnsi="Calibri" w:cs="Calibri"/>
+          <w:noProof/>
         </w:rPr>
         <w:drawing>
           <wp:inline distT="0" distB="0" distL="0" distR="0" wp14:anchorId="0AE9D2E6" wp14:editId="7B1E9768">
@@ -3747,6 +3957,7 @@
             <w14:bevel/>
           </w14:textOutline>
         </w:rPr>
+        <w:lastRenderedPageBreak/>
         <w:t>Program Execution Screenshots</w:t>
       </w:r>
     </w:p>
@@ -3780,6 +3991,7 @@
       <w:r>
         <w:rPr>
           <w:rFonts w:ascii="Calibri" w:hAnsi="Calibri" w:cs="Calibri"/>
+          <w:noProof/>
         </w:rPr>
         <w:drawing>
           <wp:inline distT="0" distB="0" distL="0" distR="0" wp14:anchorId="0FDDDE3B" wp14:editId="782FD624">
@@ -3834,6 +4046,7 @@
       <w:r>
         <w:rPr>
           <w:rFonts w:ascii="Calibri" w:hAnsi="Calibri" w:cs="Calibri"/>
+          <w:noProof/>
         </w:rPr>
         <w:drawing>
           <wp:inline distT="0" distB="0" distL="0" distR="0" wp14:anchorId="7EF93B3C" wp14:editId="12298DC2">
@@ -3933,6 +4146,7 @@
           <w:b/>
           <w:bCs/>
         </w:rPr>
+        <w:lastRenderedPageBreak/>
         <w:t xml:space="preserve">Validation </w:t>
       </w:r>
       <w:r>
@@ -3967,6 +4181,7 @@
       <w:r>
         <w:rPr>
           <w:rFonts w:ascii="Calibri" w:hAnsi="Calibri" w:cs="Calibri"/>
+          <w:noProof/>
         </w:rPr>
         <w:drawing>
           <wp:inline distT="0" distB="0" distL="0" distR="0" wp14:anchorId="6CF48DEA" wp14:editId="4936F78F">
@@ -4021,6 +4236,7 @@
       <w:r>
         <w:rPr>
           <w:rFonts w:ascii="Calibri" w:hAnsi="Calibri" w:cs="Calibri"/>
+          <w:noProof/>
         </w:rPr>
         <w:drawing>
           <wp:inline distT="0" distB="0" distL="0" distR="0" wp14:anchorId="58399D59" wp14:editId="2A7E0414">
@@ -4100,18 +4316,33 @@
         <w:rPr>
           <w:rFonts w:ascii="Calibri" w:hAnsi="Calibri" w:cs="Calibri"/>
         </w:rPr>
-        <w:t xml:space="preserve"> When first number is provided with valid value and second number is empty, validation message should be shown and should ask to re-enter second number </w:t>
-      </w:r>
-    </w:p>
-    <w:p>
-      <w:pPr>
-        <w:rPr>
-          <w:rFonts w:ascii="Calibri" w:hAnsi="Calibri" w:cs="Calibri"/>
-        </w:rPr>
-      </w:pPr>
-      <w:r>
-        <w:rPr>
-          <w:rFonts w:ascii="Calibri" w:hAnsi="Calibri" w:cs="Calibri"/>
+        <w:t xml:space="preserve"> When first number is provided with valid value and second number is empty, validation message should be shown </w:t>
+      </w:r>
+      <w:proofErr w:type="gramStart"/>
+      <w:r>
+        <w:rPr>
+          <w:rFonts w:ascii="Calibri" w:hAnsi="Calibri" w:cs="Calibri"/>
+        </w:rPr>
+        <w:t>and</w:t>
+      </w:r>
+      <w:proofErr w:type="gramEnd"/>
+      <w:r>
+        <w:rPr>
+          <w:rFonts w:ascii="Calibri" w:hAnsi="Calibri" w:cs="Calibri"/>
+        </w:rPr>
+        <w:t xml:space="preserve"> should ask to re-enter second number </w:t>
+      </w:r>
+    </w:p>
+    <w:p>
+      <w:pPr>
+        <w:rPr>
+          <w:rFonts w:ascii="Calibri" w:hAnsi="Calibri" w:cs="Calibri"/>
+        </w:rPr>
+      </w:pPr>
+      <w:r>
+        <w:rPr>
+          <w:rFonts w:ascii="Calibri" w:hAnsi="Calibri" w:cs="Calibri"/>
+          <w:noProof/>
         </w:rPr>
         <w:drawing>
           <wp:inline distT="0" distB="0" distL="0" distR="0" wp14:anchorId="189C38FE" wp14:editId="018D0812">
@@ -4203,6 +4434,7 @@
       <w:r>
         <w:rPr>
           <w:rFonts w:ascii="Calibri" w:hAnsi="Calibri" w:cs="Calibri"/>
+          <w:noProof/>
         </w:rPr>
         <w:drawing>
           <wp:inline distT="0" distB="0" distL="0" distR="0" wp14:anchorId="6FA34804" wp14:editId="7C45B103">
@@ -4267,6 +4499,7 @@
           <w:b/>
           <w:bCs/>
         </w:rPr>
+        <w:lastRenderedPageBreak/>
         <w:t xml:space="preserve">Validation </w:t>
       </w:r>
       <w:r>
@@ -4421,6 +4654,7 @@
       <w:r>
         <w:rPr>
           <w:rFonts w:ascii="Calibri" w:hAnsi="Calibri" w:cs="Calibri"/>
+          <w:noProof/>
         </w:rPr>
         <w:drawing>
           <wp:inline distT="0" distB="0" distL="0" distR="0" wp14:anchorId="4FE8C437" wp14:editId="7D7B3B58">
@@ -4578,6 +4812,7 @@
           <w:kern w:val="0"/>
           <w14:ligatures w14:val="none"/>
         </w:rPr>
+        <w:lastRenderedPageBreak/>
         <w:t xml:space="preserve">Part </w:t>
       </w:r>
       <w:r>
@@ -4670,6 +4905,9 @@
     </w:p>
     <w:p>
       <w:r>
+        <w:rPr>
+          <w:noProof/>
+        </w:rPr>
         <w:drawing>
           <wp:inline distT="0" distB="0" distL="0" distR="0" wp14:anchorId="41565825" wp14:editId="7089AA5B">
             <wp:extent cx="5943600" cy="3176270"/>
@@ -4725,6 +4963,9 @@
     </w:p>
     <w:p>
       <w:r>
+        <w:rPr>
+          <w:noProof/>
+        </w:rPr>
         <w:drawing>
           <wp:inline distT="0" distB="0" distL="0" distR="0" wp14:anchorId="2C213B86" wp14:editId="4707B98F">
             <wp:extent cx="5943600" cy="1261110"/>
@@ -4776,7 +5017,6 @@
           <w:b/>
           <w:bCs/>
         </w:rPr>
-        <w:lastRenderedPageBreak/>
         <w:t xml:space="preserve">Initialize Git </w:t>
       </w:r>
       <w:r>
@@ -4784,19 +5024,36 @@
           <w:b/>
           <w:bCs/>
         </w:rPr>
-        <w:t>using “git init”</w:t>
-      </w:r>
-      <w:r>
-        <w:rPr>
-          <w:b/>
-          <w:bCs/>
-        </w:rPr>
-        <w:br/>
-      </w:r>
-      <w:r>
-        <w:rPr>
-          <w:b/>
-          <w:bCs/>
+        <w:t xml:space="preserve">using “git </w:t>
+      </w:r>
+      <w:proofErr w:type="spellStart"/>
+      <w:r>
+        <w:rPr>
+          <w:b/>
+          <w:bCs/>
+        </w:rPr>
+        <w:t>init</w:t>
+      </w:r>
+      <w:proofErr w:type="spellEnd"/>
+      <w:r>
+        <w:rPr>
+          <w:b/>
+          <w:bCs/>
+        </w:rPr>
+        <w:t>”</w:t>
+      </w:r>
+      <w:r>
+        <w:rPr>
+          <w:b/>
+          <w:bCs/>
+        </w:rPr>
+        <w:br/>
+      </w:r>
+      <w:r>
+        <w:rPr>
+          <w:b/>
+          <w:bCs/>
+          <w:noProof/>
         </w:rPr>
         <w:drawing>
           <wp:inline distT="0" distB="0" distL="0" distR="0" wp14:anchorId="24E336E1" wp14:editId="2C2E1E73">
@@ -4855,20 +5112,38 @@
           <w:b/>
           <w:bCs/>
         </w:rPr>
-        <w:t>Add Files using “git add .”</w:t>
-      </w:r>
-    </w:p>
-    <w:p>
-      <w:pPr>
-        <w:rPr>
-          <w:b/>
-          <w:bCs/>
-        </w:rPr>
-      </w:pPr>
-      <w:r>
-        <w:rPr>
-          <w:b/>
-          <w:bCs/>
+        <w:lastRenderedPageBreak/>
+        <w:t xml:space="preserve">Add Files using “git </w:t>
+      </w:r>
+      <w:proofErr w:type="gramStart"/>
+      <w:r>
+        <w:rPr>
+          <w:b/>
+          <w:bCs/>
+        </w:rPr>
+        <w:t>add .</w:t>
+      </w:r>
+      <w:proofErr w:type="gramEnd"/>
+      <w:r>
+        <w:rPr>
+          <w:b/>
+          <w:bCs/>
+        </w:rPr>
+        <w:t>”</w:t>
+      </w:r>
+    </w:p>
+    <w:p>
+      <w:pPr>
+        <w:rPr>
+          <w:b/>
+          <w:bCs/>
+        </w:rPr>
+      </w:pPr>
+      <w:r>
+        <w:rPr>
+          <w:b/>
+          <w:bCs/>
+          <w:noProof/>
         </w:rPr>
         <w:drawing>
           <wp:inline distT="0" distB="0" distL="0" distR="0" wp14:anchorId="7071AAA5" wp14:editId="5A4BA5DD">
@@ -4932,6 +5207,9 @@
     </w:p>
     <w:p>
       <w:r>
+        <w:rPr>
+          <w:noProof/>
+        </w:rPr>
         <w:drawing>
           <wp:inline distT="0" distB="0" distL="0" distR="0" wp14:anchorId="60B1FC20" wp14:editId="20223990">
             <wp:extent cx="5943600" cy="1397635"/>
@@ -4997,8 +5275,17 @@
           <w:b/>
           <w:bCs/>
         </w:rPr>
-        <w:t>https://github.com/shadab05shah/CSC500---Principles-of-Programming.git</w:t>
-      </w:r>
+        <w:t>https://github.com/shadab05shah/CSC500---Principles-of-</w:t>
+      </w:r>
+      <w:proofErr w:type="spellStart"/>
+      <w:r>
+        <w:rPr>
+          <w:b/>
+          <w:bCs/>
+        </w:rPr>
+        <w:t>Programming.git</w:t>
+      </w:r>
+      <w:proofErr w:type="spellEnd"/>
       <w:r>
         <w:rPr>
           <w:b/>
@@ -5009,6 +5296,9 @@
     </w:p>
     <w:p>
       <w:r>
+        <w:rPr>
+          <w:noProof/>
+        </w:rPr>
         <w:drawing>
           <wp:inline distT="0" distB="0" distL="0" distR="0" wp14:anchorId="300823B6" wp14:editId="032F7110">
             <wp:extent cx="5943600" cy="1539875"/>
@@ -5060,49 +5350,61 @@
           <w:b/>
           <w:bCs/>
         </w:rPr>
+        <w:t xml:space="preserve">Pushing Changes to </w:t>
+      </w:r>
+      <w:proofErr w:type="spellStart"/>
+      <w:r>
+        <w:rPr>
+          <w:b/>
+          <w:bCs/>
+        </w:rPr>
+        <w:t>Github</w:t>
+      </w:r>
+      <w:proofErr w:type="spellEnd"/>
+      <w:r>
+        <w:rPr>
+          <w:b/>
+          <w:bCs/>
+        </w:rPr>
+        <w:t xml:space="preserve"> using </w:t>
+      </w:r>
+    </w:p>
+    <w:p>
+      <w:pPr>
+        <w:rPr>
+          <w:b/>
+          <w:bCs/>
+        </w:rPr>
+      </w:pPr>
+      <w:r>
+        <w:rPr>
+          <w:b/>
+          <w:bCs/>
+        </w:rPr>
+        <w:t>Git branch -M main</w:t>
+      </w:r>
+    </w:p>
+    <w:p>
+      <w:pPr>
+        <w:rPr>
+          <w:b/>
+          <w:bCs/>
+        </w:rPr>
+      </w:pPr>
+      <w:r>
+        <w:rPr>
+          <w:b/>
+          <w:bCs/>
+        </w:rPr>
+        <w:t>Git push -u origin main</w:t>
+      </w:r>
+    </w:p>
+    <w:p>
+      <w:r>
+        <w:rPr>
+          <w:noProof/>
+        </w:rPr>
         <w:lastRenderedPageBreak/>
-        <w:t>Pushing Changes to Github</w:t>
-      </w:r>
-      <w:r>
-        <w:rPr>
-          <w:b/>
-          <w:bCs/>
-        </w:rPr>
-        <w:t xml:space="preserve"> using </w:t>
-      </w:r>
-    </w:p>
-    <w:p>
-      <w:pPr>
-        <w:rPr>
-          <w:b/>
-          <w:bCs/>
-        </w:rPr>
-      </w:pPr>
-      <w:r>
-        <w:rPr>
-          <w:b/>
-          <w:bCs/>
-        </w:rPr>
-        <w:t>Git branch -M main</w:t>
-      </w:r>
-    </w:p>
-    <w:p>
-      <w:pPr>
-        <w:rPr>
-          <w:b/>
-          <w:bCs/>
-        </w:rPr>
-      </w:pPr>
-      <w:r>
-        <w:rPr>
-          <w:b/>
-          <w:bCs/>
-        </w:rPr>
-        <w:t>Git push -u origin main</w:t>
-      </w:r>
-    </w:p>
-    <w:p>
-      <w:r>
         <w:drawing>
           <wp:inline distT="0" distB="0" distL="0" distR="0" wp14:anchorId="59AAB0CE" wp14:editId="03B3CA99">
             <wp:extent cx="5943600" cy="2333625"/>
@@ -5179,6 +5481,9 @@
     </w:p>
     <w:p>
       <w:r>
+        <w:rPr>
+          <w:noProof/>
+        </w:rPr>
         <w:drawing>
           <wp:inline distT="0" distB="0" distL="0" distR="0" wp14:anchorId="3DE45C1C" wp14:editId="1DEA234B">
             <wp:extent cx="5943600" cy="3364230"/>
@@ -5831,6 +6136,7 @@
   <w:style w:type="character" w:default="1" w:styleId="DefaultParagraphFont">
     <w:name w:val="Default Paragraph Font"/>
     <w:uiPriority w:val="1"/>
+    <w:semiHidden/>
     <w:unhideWhenUsed/>
   </w:style>
   <w:style w:type="table" w:default="1" w:styleId="TableNormal">

</xml_diff>